<commit_message>
a partially maybe potentially cool m4 code
</commit_message>
<xml_diff>
--- a/Milestone4/Gohlwar-Goohs-Norman-M4-Doc.docx
+++ b/Milestone4/Gohlwar-Goohs-Norman-M4-Doc.docx
@@ -17,13 +17,63 @@
         <w:t>CS3070 Operating Systems</w:t>
       </w:r>
     </w:p>
-    <w:p/>
     <w:p>
-      <w:r>
-        <w:t>D</w:t>
-      </w:r>
-      <w:r>
-        <w:t xml:space="preserve">1. Proof what we built is a Semaphore. Semaphores have 3 properties: mutual exclusion, progression of processes, and no race conditions in counter updates. </w:t>
+      <w:pPr>
+        <w:rPr>
+          <w:highlight w:val="yellow"/>
+        </w:rPr>
+      </w:pPr>
+      <w:r>
+        <w:rPr>
+          <w:b/>
+          <w:bCs/>
+          <w:highlight w:val="yellow"/>
+        </w:rPr>
+        <w:t>Proof by Contradiction:</w:t>
+      </w:r>
+      <w:r>
+        <w:rPr>
+          <w:highlight w:val="yellow"/>
+        </w:rPr>
+        <w:t xml:space="preserve"> Assume k processes (where k &gt;= 2) are currently in the critical section, protected by </w:t>
+      </w:r>
+      <w:r>
+        <w:rPr>
+          <w:highlight w:val="yellow"/>
+        </w:rPr>
+        <w:t>the</w:t>
+      </w:r>
+      <w:r>
+        <w:rPr>
+          <w:highlight w:val="yellow"/>
+        </w:rPr>
+        <w:t xml:space="preserve"> </w:t>
+      </w:r>
+      <w:r>
+        <w:rPr>
+          <w:highlight w:val="yellow"/>
+        </w:rPr>
+        <w:t>atomic lock</w:t>
+      </w:r>
+      <w:r>
+        <w:rPr>
+          <w:highlight w:val="yellow"/>
+        </w:rPr>
+        <w:t xml:space="preserve">. All operations on the semaphore's internal state are protected by </w:t>
+      </w:r>
+      <w:proofErr w:type="spellStart"/>
+      <w:r>
+        <w:rPr>
+          <w:highlight w:val="yellow"/>
+        </w:rPr>
+        <w:t>self.lock.acquire</w:t>
+      </w:r>
+      <w:proofErr w:type="spellEnd"/>
+      <w:r>
+        <w:rPr>
+          <w:highlight w:val="yellow"/>
+        </w:rPr>
+        <w:t>(caller) in both internal critical sections, ensuring they act as a single atomic critical section for the semaphore's internal state.</w:t>
       </w:r>
     </w:p>
     <w:p>
@@ -36,685 +86,129 @@
         <w:rPr>
           <w:highlight w:val="yellow"/>
         </w:rPr>
-        <w:t xml:space="preserve">Proof 1: Mutual Exclusion (Claim is that at most one process can </w:t>
-      </w:r>
-      <w:r>
-        <w:rPr>
-          <w:highlight w:val="yellow"/>
-        </w:rPr>
-        <w:t>be in the critical section at one time.</w:t>
-      </w:r>
-      <w:r>
-        <w:rPr>
-          <w:highlight w:val="yellow"/>
-        </w:rPr>
-        <w:t>)</w:t>
+        <w:t xml:space="preserve">Since all k processes are in the critical section, each must have successfully executed </w:t>
+      </w:r>
+      <w:proofErr w:type="spellStart"/>
+      <w:r>
+        <w:rPr>
+          <w:highlight w:val="yellow"/>
+        </w:rPr>
+        <w:t>self.lock.acquire</w:t>
+      </w:r>
+      <w:proofErr w:type="spellEnd"/>
+      <w:r>
+        <w:rPr>
+          <w:highlight w:val="yellow"/>
+        </w:rPr>
+        <w:t>(caller).</w:t>
+      </w:r>
+      <w:r>
+        <w:rPr>
+          <w:highlight w:val="yellow"/>
+        </w:rPr>
+        <w:t xml:space="preserve"> </w:t>
       </w:r>
     </w:p>
     <w:p>
       <w:pPr>
-        <w:pStyle w:val="ListParagraph"/>
-        <w:numPr>
-          <w:ilvl w:val="0"/>
-          <w:numId w:val="2"/>
-        </w:numPr>
-        <w:rPr>
-          <w:highlight w:val="yellow"/>
-        </w:rPr>
-      </w:pPr>
-      <w:r>
-        <w:rPr>
-          <w:highlight w:val="yellow"/>
-        </w:rPr>
-        <w:t xml:space="preserve">Proof by contradiction. Assume more than one process can </w:t>
-      </w:r>
-      <w:r>
-        <w:rPr>
-          <w:highlight w:val="yellow"/>
-        </w:rPr>
-        <w:t>be in the critical section at one time.</w:t>
+        <w:rPr>
+          <w:highlight w:val="yellow"/>
+        </w:rPr>
+      </w:pPr>
+      <w:r>
+        <w:rPr>
+          <w:b/>
+          <w:bCs/>
+          <w:highlight w:val="yellow"/>
+        </w:rPr>
+        <w:t>Contradiction:</w:t>
+      </w:r>
+      <w:r>
+        <w:rPr>
+          <w:highlight w:val="yellow"/>
+        </w:rPr>
+        <w:t xml:space="preserve"> </w:t>
+      </w:r>
+      <w:r>
+        <w:rPr>
+          <w:highlight w:val="yellow"/>
+        </w:rPr>
+        <w:t xml:space="preserve">Some </w:t>
+      </w:r>
+      <w:r>
+        <w:rPr>
+          <w:highlight w:val="yellow"/>
+        </w:rPr>
+        <w:t>processes go</w:t>
+      </w:r>
+      <w:r>
+        <w:rPr>
+          <w:highlight w:val="yellow"/>
+        </w:rPr>
+        <w:t>es</w:t>
+      </w:r>
+      <w:r>
+        <w:rPr>
+          <w:highlight w:val="yellow"/>
+        </w:rPr>
+        <w:t xml:space="preserve"> first and executes </w:t>
+      </w:r>
+      <w:proofErr w:type="spellStart"/>
+      <w:r>
+        <w:rPr>
+          <w:highlight w:val="yellow"/>
+        </w:rPr>
+        <w:t>self.lock.acquire</w:t>
+      </w:r>
+      <w:proofErr w:type="spellEnd"/>
+      <w:r>
+        <w:rPr>
+          <w:highlight w:val="yellow"/>
+        </w:rPr>
+        <w:t xml:space="preserve">(caller), acquiring the lock exclusively. When another process attempts </w:t>
+      </w:r>
+      <w:proofErr w:type="spellStart"/>
+      <w:r>
+        <w:rPr>
+          <w:highlight w:val="yellow"/>
+        </w:rPr>
+        <w:t>self.lock.acquire</w:t>
+      </w:r>
+      <w:proofErr w:type="spellEnd"/>
+      <w:r>
+        <w:rPr>
+          <w:highlight w:val="yellow"/>
+        </w:rPr>
+        <w:t xml:space="preserve">(caller), it cannot return because the lock is already held. However, our assumption states this other process (and all subsequent processes) are already in the critical section, which directly contradicts the fact that their </w:t>
+      </w:r>
+      <w:proofErr w:type="spellStart"/>
+      <w:r>
+        <w:rPr>
+          <w:highlight w:val="yellow"/>
+        </w:rPr>
+        <w:t>self.lock.acquire</w:t>
+      </w:r>
+      <w:proofErr w:type="spellEnd"/>
+      <w:r>
+        <w:rPr>
+          <w:highlight w:val="yellow"/>
+        </w:rPr>
+        <w:t>(caller) calls have not yet returned.</w:t>
       </w:r>
     </w:p>
     <w:p>
       <w:pPr>
-        <w:pStyle w:val="ListParagraph"/>
-        <w:numPr>
-          <w:ilvl w:val="0"/>
-          <w:numId w:val="2"/>
-        </w:numPr>
-        <w:rPr>
-          <w:highlight w:val="yellow"/>
-        </w:rPr>
-      </w:pPr>
-      <w:r>
-        <w:rPr>
-          <w:highlight w:val="yellow"/>
-        </w:rPr>
-        <w:t xml:space="preserve">For more than one </w:t>
-      </w:r>
-      <w:r>
-        <w:rPr>
-          <w:highlight w:val="yellow"/>
-        </w:rPr>
-        <w:t>process</w:t>
-      </w:r>
-      <w:r>
-        <w:rPr>
-          <w:highlight w:val="yellow"/>
-        </w:rPr>
-        <w:t xml:space="preserve"> to </w:t>
-      </w:r>
-      <w:r>
-        <w:rPr>
-          <w:highlight w:val="yellow"/>
-        </w:rPr>
-        <w:t>be in the critical section</w:t>
-      </w:r>
-      <w:r>
-        <w:rPr>
-          <w:highlight w:val="yellow"/>
-        </w:rPr>
-        <w:t xml:space="preserve"> at one time, each process would have </w:t>
-      </w:r>
-      <w:r>
-        <w:rPr>
-          <w:highlight w:val="yellow"/>
-        </w:rPr>
-        <w:t xml:space="preserve">successfully </w:t>
-      </w:r>
-      <w:r>
-        <w:rPr>
-          <w:highlight w:val="yellow"/>
-        </w:rPr>
-        <w:t xml:space="preserve">called </w:t>
-      </w:r>
-      <w:proofErr w:type="gramStart"/>
-      <w:r>
-        <w:rPr>
-          <w:highlight w:val="yellow"/>
-        </w:rPr>
-        <w:t>WAIT(</w:t>
-      </w:r>
-      <w:proofErr w:type="spellStart"/>
-      <w:r>
-        <w:rPr>
-          <w:highlight w:val="yellow"/>
-        </w:rPr>
-        <w:t>self,caller</w:t>
-      </w:r>
-      <w:proofErr w:type="spellEnd"/>
-      <w:proofErr w:type="gramEnd"/>
-      <w:r>
-        <w:rPr>
-          <w:highlight w:val="yellow"/>
-        </w:rPr>
-        <w:t>)</w:t>
-      </w:r>
-      <w:r>
-        <w:rPr>
-          <w:highlight w:val="yellow"/>
-        </w:rPr>
-        <w:t xml:space="preserve"> </w:t>
-      </w:r>
-      <w:r>
-        <w:rPr>
-          <w:highlight w:val="yellow"/>
-        </w:rPr>
-        <w:t xml:space="preserve">and </w:t>
-      </w:r>
-      <w:proofErr w:type="spellStart"/>
-      <w:proofErr w:type="gramStart"/>
-      <w:r>
-        <w:rPr>
-          <w:highlight w:val="yellow"/>
-        </w:rPr>
-        <w:t>self.lock</w:t>
-      </w:r>
-      <w:proofErr w:type="gramEnd"/>
-      <w:r>
-        <w:rPr>
-          <w:highlight w:val="yellow"/>
-        </w:rPr>
-        <w:t>.acquire</w:t>
-      </w:r>
-      <w:proofErr w:type="spellEnd"/>
-      <w:r>
-        <w:rPr>
-          <w:highlight w:val="yellow"/>
-        </w:rPr>
-        <w:t>(caller)</w:t>
-      </w:r>
-      <w:r>
-        <w:rPr>
-          <w:highlight w:val="yellow"/>
-        </w:rPr>
-        <w:t>.</w:t>
+        <w:rPr>
+          <w:highlight w:val="yellow"/>
+        </w:rPr>
+      </w:pPr>
+      <w:r>
+        <w:rPr>
+          <w:highlight w:val="yellow"/>
+        </w:rPr>
+        <w:t>Therefore, our assumption is false, and at most one process can be in the critical section at any time.</w:t>
       </w:r>
     </w:p>
-    <w:p>
-      <w:pPr>
-        <w:pStyle w:val="ListParagraph"/>
-        <w:numPr>
-          <w:ilvl w:val="0"/>
-          <w:numId w:val="2"/>
-        </w:numPr>
-        <w:rPr>
-          <w:highlight w:val="yellow"/>
-        </w:rPr>
-      </w:pPr>
-      <w:r>
-        <w:rPr>
-          <w:highlight w:val="yellow"/>
-        </w:rPr>
-        <w:t xml:space="preserve">Contradiction: </w:t>
-      </w:r>
-      <w:proofErr w:type="spellStart"/>
-      <w:proofErr w:type="gramStart"/>
-      <w:r>
-        <w:rPr>
-          <w:highlight w:val="yellow"/>
-        </w:rPr>
-        <w:t>self.lock</w:t>
-      </w:r>
-      <w:proofErr w:type="gramEnd"/>
-      <w:r>
-        <w:rPr>
-          <w:highlight w:val="yellow"/>
-        </w:rPr>
-        <w:t>.acquire</w:t>
-      </w:r>
-      <w:proofErr w:type="spellEnd"/>
-      <w:r>
-        <w:rPr>
-          <w:highlight w:val="yellow"/>
-        </w:rPr>
-        <w:t>(caller) can only be reached when</w:t>
-      </w:r>
-      <w:r>
-        <w:rPr>
-          <w:highlight w:val="yellow"/>
-        </w:rPr>
-        <w:t xml:space="preserve"> </w:t>
-      </w:r>
-      <w:proofErr w:type="spellStart"/>
-      <w:proofErr w:type="gramStart"/>
-      <w:r>
-        <w:rPr>
-          <w:highlight w:val="yellow"/>
-        </w:rPr>
-        <w:t>self.counter</w:t>
-      </w:r>
-      <w:proofErr w:type="spellEnd"/>
-      <w:proofErr w:type="gramEnd"/>
-      <w:r>
-        <w:rPr>
-          <w:highlight w:val="yellow"/>
-        </w:rPr>
-        <w:t xml:space="preserve"> == 1. However, once the first process executes this code block, </w:t>
-      </w:r>
-      <w:proofErr w:type="spellStart"/>
-      <w:proofErr w:type="gramStart"/>
-      <w:r>
-        <w:rPr>
-          <w:highlight w:val="yellow"/>
-        </w:rPr>
-        <w:t>self.counter</w:t>
-      </w:r>
-      <w:proofErr w:type="spellEnd"/>
-      <w:proofErr w:type="gramEnd"/>
-      <w:r>
-        <w:rPr>
-          <w:highlight w:val="yellow"/>
-        </w:rPr>
-        <w:t xml:space="preserve"> is set to 0 so any subsequent process calling </w:t>
-      </w:r>
-      <w:proofErr w:type="gramStart"/>
-      <w:r>
-        <w:rPr>
-          <w:highlight w:val="yellow"/>
-        </w:rPr>
-        <w:t>WAIT(</w:t>
-      </w:r>
-      <w:proofErr w:type="gramEnd"/>
-      <w:r>
-        <w:rPr>
-          <w:highlight w:val="yellow"/>
-        </w:rPr>
-        <w:t xml:space="preserve">) will be meeting condition </w:t>
-      </w:r>
-      <w:proofErr w:type="spellStart"/>
-      <w:proofErr w:type="gramStart"/>
-      <w:r>
-        <w:rPr>
-          <w:highlight w:val="yellow"/>
-        </w:rPr>
-        <w:t>self.counter</w:t>
-      </w:r>
-      <w:proofErr w:type="spellEnd"/>
-      <w:proofErr w:type="gramEnd"/>
-      <w:r>
-        <w:rPr>
-          <w:highlight w:val="yellow"/>
-        </w:rPr>
-        <w:t xml:space="preserve"> == 0 and therefore will be appended to the queue</w:t>
-      </w:r>
-      <w:r>
-        <w:rPr>
-          <w:highlight w:val="yellow"/>
-        </w:rPr>
-        <w:t xml:space="preserve"> via </w:t>
-      </w:r>
-      <w:proofErr w:type="spellStart"/>
-      <w:proofErr w:type="gramStart"/>
-      <w:r>
-        <w:rPr>
-          <w:highlight w:val="yellow"/>
-        </w:rPr>
-        <w:t>self.queue</w:t>
-      </w:r>
-      <w:proofErr w:type="gramEnd"/>
-      <w:r>
-        <w:rPr>
-          <w:highlight w:val="yellow"/>
-        </w:rPr>
-        <w:t>.append</w:t>
-      </w:r>
-      <w:proofErr w:type="spellEnd"/>
-      <w:r>
-        <w:rPr>
-          <w:highlight w:val="yellow"/>
-        </w:rPr>
-        <w:t xml:space="preserve">(caller) and put to sleep using </w:t>
-      </w:r>
-      <w:proofErr w:type="spellStart"/>
-      <w:proofErr w:type="gramStart"/>
-      <w:r>
-        <w:rPr>
-          <w:highlight w:val="yellow"/>
-        </w:rPr>
-        <w:t>caller.sleep</w:t>
-      </w:r>
-      <w:proofErr w:type="spellEnd"/>
-      <w:proofErr w:type="gramEnd"/>
-      <w:r>
-        <w:rPr>
-          <w:highlight w:val="yellow"/>
-        </w:rPr>
-        <w:t>()</w:t>
-      </w:r>
-      <w:r>
-        <w:rPr>
-          <w:highlight w:val="yellow"/>
-        </w:rPr>
-        <w:t>.</w:t>
-      </w:r>
-    </w:p>
-    <w:p>
-      <w:pPr>
-        <w:pStyle w:val="ListParagraph"/>
-        <w:numPr>
-          <w:ilvl w:val="0"/>
-          <w:numId w:val="2"/>
-        </w:numPr>
-        <w:rPr>
-          <w:highlight w:val="yellow"/>
-        </w:rPr>
-      </w:pPr>
-      <w:r>
-        <w:rPr>
-          <w:highlight w:val="yellow"/>
-        </w:rPr>
-        <w:t xml:space="preserve">Therefore, </w:t>
-      </w:r>
-      <w:r>
-        <w:rPr>
-          <w:highlight w:val="yellow"/>
-        </w:rPr>
-        <w:t>it’s</w:t>
-      </w:r>
-      <w:r>
-        <w:rPr>
-          <w:highlight w:val="yellow"/>
-        </w:rPr>
-        <w:t xml:space="preserve"> impossible for more than one process to </w:t>
-      </w:r>
-      <w:r>
-        <w:rPr>
-          <w:highlight w:val="yellow"/>
-        </w:rPr>
-        <w:t>be in the critical section at any time.</w:t>
-      </w:r>
-    </w:p>
-    <w:p>
-      <w:pPr>
-        <w:rPr>
-          <w:highlight w:val="yellow"/>
-        </w:rPr>
-      </w:pPr>
-      <w:r>
-        <w:rPr>
-          <w:highlight w:val="yellow"/>
-        </w:rPr>
-        <w:t xml:space="preserve">Proof 2: </w:t>
-      </w:r>
-      <w:r>
-        <w:rPr>
-          <w:highlight w:val="yellow"/>
-        </w:rPr>
-        <w:t>Progress (Claim is that if the semaphore is available and processes are waiting, one will eventually acquire it).</w:t>
-      </w:r>
-    </w:p>
-    <w:p>
-      <w:pPr>
-        <w:pStyle w:val="ListParagraph"/>
-        <w:numPr>
-          <w:ilvl w:val="0"/>
-          <w:numId w:val="3"/>
-        </w:numPr>
-        <w:rPr>
-          <w:highlight w:val="yellow"/>
-        </w:rPr>
-      </w:pPr>
-      <w:r>
-        <w:rPr>
-          <w:highlight w:val="yellow"/>
-        </w:rPr>
-        <w:t>Proof by contradiction. Assume that if semaphore is available and processes are waiting, no process will acquire it.</w:t>
-      </w:r>
-    </w:p>
-    <w:p>
-      <w:pPr>
-        <w:pStyle w:val="ListParagraph"/>
-        <w:numPr>
-          <w:ilvl w:val="0"/>
-          <w:numId w:val="3"/>
-        </w:numPr>
-        <w:rPr>
-          <w:highlight w:val="yellow"/>
-        </w:rPr>
-      </w:pPr>
-      <w:r>
-        <w:rPr>
-          <w:highlight w:val="yellow"/>
-        </w:rPr>
-        <w:t xml:space="preserve">For this to occur, </w:t>
-      </w:r>
-      <w:r>
-        <w:rPr>
-          <w:highlight w:val="yellow"/>
-        </w:rPr>
-        <w:t>processes waiting would have to remain sleeping despite the free lock.</w:t>
-      </w:r>
-    </w:p>
-    <w:p>
-      <w:pPr>
-        <w:pStyle w:val="ListParagraph"/>
-        <w:numPr>
-          <w:ilvl w:val="0"/>
-          <w:numId w:val="3"/>
-        </w:numPr>
-        <w:rPr>
-          <w:highlight w:val="yellow"/>
-        </w:rPr>
-      </w:pPr>
-      <w:r>
-        <w:rPr>
-          <w:highlight w:val="yellow"/>
-        </w:rPr>
-        <w:t xml:space="preserve">Contradiction: If </w:t>
-      </w:r>
-      <w:proofErr w:type="gramStart"/>
-      <w:r>
-        <w:rPr>
-          <w:highlight w:val="yellow"/>
-        </w:rPr>
-        <w:t>signal(</w:t>
-      </w:r>
-      <w:proofErr w:type="gramEnd"/>
-      <w:r>
-        <w:rPr>
-          <w:highlight w:val="yellow"/>
-        </w:rPr>
-        <w:t xml:space="preserve">) is called, the lock is released and if the queue is not empty, the next process is woken up. If there’s nothing in the queue, there is nothing to </w:t>
-      </w:r>
-      <w:proofErr w:type="spellStart"/>
-      <w:proofErr w:type="gramStart"/>
-      <w:r>
-        <w:rPr>
-          <w:highlight w:val="yellow"/>
-        </w:rPr>
-        <w:t>wakeup</w:t>
-      </w:r>
-      <w:proofErr w:type="spellEnd"/>
-      <w:proofErr w:type="gramEnd"/>
-      <w:r>
-        <w:rPr>
-          <w:highlight w:val="yellow"/>
-        </w:rPr>
-        <w:t xml:space="preserve">, but the counter is set to 1 such that an incoming process can acquire the lock in </w:t>
-      </w:r>
-      <w:proofErr w:type="gramStart"/>
-      <w:r>
-        <w:rPr>
-          <w:highlight w:val="yellow"/>
-        </w:rPr>
-        <w:t>WAIT(</w:t>
-      </w:r>
-      <w:proofErr w:type="gramEnd"/>
-      <w:r>
-        <w:rPr>
-          <w:highlight w:val="yellow"/>
-        </w:rPr>
-        <w:t xml:space="preserve">) since </w:t>
-      </w:r>
-      <w:proofErr w:type="spellStart"/>
-      <w:proofErr w:type="gramStart"/>
-      <w:r>
-        <w:rPr>
-          <w:highlight w:val="yellow"/>
-        </w:rPr>
-        <w:t>self.counter</w:t>
-      </w:r>
-      <w:proofErr w:type="spellEnd"/>
-      <w:proofErr w:type="gramEnd"/>
-      <w:r>
-        <w:rPr>
-          <w:highlight w:val="yellow"/>
-        </w:rPr>
-        <w:t xml:space="preserve"> == 1.</w:t>
-      </w:r>
-    </w:p>
-    <w:p>
-      <w:pPr>
-        <w:pStyle w:val="ListParagraph"/>
-        <w:numPr>
-          <w:ilvl w:val="0"/>
-          <w:numId w:val="3"/>
-        </w:numPr>
-        <w:rPr>
-          <w:highlight w:val="yellow"/>
-        </w:rPr>
-      </w:pPr>
-      <w:r>
-        <w:rPr>
-          <w:highlight w:val="yellow"/>
-        </w:rPr>
-        <w:t>Therefore, if the semaphore is available and processes are waiting to enter the critical section, they will enter.</w:t>
-      </w:r>
-    </w:p>
-    <w:p>
-      <w:pPr>
-        <w:rPr>
-          <w:highlight w:val="yellow"/>
-        </w:rPr>
-      </w:pPr>
-      <w:r>
-        <w:rPr>
-          <w:highlight w:val="yellow"/>
-        </w:rPr>
-        <w:t>Proof 3: No Race Conditions (Claim that the counter value is consistent with the lock state)</w:t>
-      </w:r>
-    </w:p>
-    <w:p>
-      <w:pPr>
-        <w:pStyle w:val="ListParagraph"/>
-        <w:numPr>
-          <w:ilvl w:val="0"/>
-          <w:numId w:val="4"/>
-        </w:numPr>
-        <w:rPr>
-          <w:highlight w:val="yellow"/>
-        </w:rPr>
-      </w:pPr>
-      <w:r>
-        <w:rPr>
-          <w:highlight w:val="yellow"/>
-        </w:rPr>
-        <w:t>Proof by contradiction. Assume the counter value is inconsistent with the lock state.</w:t>
-      </w:r>
-    </w:p>
-    <w:p>
-      <w:pPr>
-        <w:pStyle w:val="ListParagraph"/>
-        <w:numPr>
-          <w:ilvl w:val="0"/>
-          <w:numId w:val="4"/>
-        </w:numPr>
-        <w:rPr>
-          <w:highlight w:val="yellow"/>
-        </w:rPr>
-      </w:pPr>
-      <w:r>
-        <w:rPr>
-          <w:highlight w:val="yellow"/>
-        </w:rPr>
-        <w:t xml:space="preserve">That would mean that </w:t>
-      </w:r>
-      <w:r>
-        <w:rPr>
-          <w:highlight w:val="yellow"/>
-        </w:rPr>
-        <w:t xml:space="preserve">the code stipulates the lock is available (counter ==1) when the counter is </w:t>
-      </w:r>
-      <w:proofErr w:type="gramStart"/>
-      <w:r>
-        <w:rPr>
-          <w:highlight w:val="yellow"/>
-        </w:rPr>
-        <w:t>actually being</w:t>
-      </w:r>
-      <w:proofErr w:type="gramEnd"/>
-      <w:r>
-        <w:rPr>
-          <w:highlight w:val="yellow"/>
-        </w:rPr>
-        <w:t xml:space="preserve"> held by </w:t>
-      </w:r>
-      <w:r>
-        <w:rPr>
-          <w:highlight w:val="yellow"/>
-        </w:rPr>
-        <w:t>a process.</w:t>
-      </w:r>
-    </w:p>
-    <w:p>
-      <w:pPr>
-        <w:pStyle w:val="ListParagraph"/>
-        <w:numPr>
-          <w:ilvl w:val="0"/>
-          <w:numId w:val="4"/>
-        </w:numPr>
-        <w:rPr>
-          <w:highlight w:val="yellow"/>
-        </w:rPr>
-      </w:pPr>
-      <w:r>
-        <w:rPr>
-          <w:highlight w:val="yellow"/>
-        </w:rPr>
-        <w:lastRenderedPageBreak/>
-        <w:t>Contradi</w:t>
-      </w:r>
-      <w:r>
-        <w:rPr>
-          <w:highlight w:val="yellow"/>
-        </w:rPr>
-        <w:t>ction</w:t>
-      </w:r>
-      <w:r>
-        <w:rPr>
-          <w:highlight w:val="yellow"/>
-        </w:rPr>
-        <w:t xml:space="preserve">: The only point in which a lock is acquired is in the </w:t>
-      </w:r>
-      <w:r>
-        <w:rPr>
-          <w:highlight w:val="yellow"/>
-        </w:rPr>
-        <w:t>if (</w:t>
-      </w:r>
-      <w:proofErr w:type="spellStart"/>
-      <w:proofErr w:type="gramStart"/>
-      <w:r>
-        <w:rPr>
-          <w:highlight w:val="yellow"/>
-        </w:rPr>
-        <w:t>self.counter</w:t>
-      </w:r>
-      <w:proofErr w:type="spellEnd"/>
-      <w:proofErr w:type="gramEnd"/>
-      <w:r>
-        <w:rPr>
-          <w:highlight w:val="yellow"/>
-        </w:rPr>
-        <w:t xml:space="preserve"> == 1) block in</w:t>
-      </w:r>
-      <w:r>
-        <w:rPr>
-          <w:highlight w:val="yellow"/>
-        </w:rPr>
-        <w:t xml:space="preserve"> </w:t>
-      </w:r>
-      <w:proofErr w:type="gramStart"/>
-      <w:r>
-        <w:rPr>
-          <w:highlight w:val="yellow"/>
-        </w:rPr>
-        <w:t>WAIT(</w:t>
-      </w:r>
-      <w:proofErr w:type="gramEnd"/>
-      <w:r>
-        <w:rPr>
-          <w:highlight w:val="yellow"/>
-        </w:rPr>
-        <w:t xml:space="preserve">), </w:t>
-      </w:r>
-      <w:r>
-        <w:rPr>
-          <w:highlight w:val="yellow"/>
-        </w:rPr>
-        <w:t>where the counter is immediately set to 0 after acquisition.</w:t>
-      </w:r>
-    </w:p>
-    <w:p>
-      <w:pPr>
-        <w:pStyle w:val="ListParagraph"/>
-        <w:numPr>
-          <w:ilvl w:val="0"/>
-          <w:numId w:val="4"/>
-        </w:numPr>
-        <w:rPr>
-          <w:highlight w:val="yellow"/>
-        </w:rPr>
-      </w:pPr>
-      <w:r>
-        <w:rPr>
-          <w:highlight w:val="yellow"/>
-        </w:rPr>
-        <w:t>Therefore, the counter accurately reflects the lock state and invalidates the potential for a race condition.</w:t>
-      </w:r>
-    </w:p>
-    <w:p/>
     <w:p>
       <w:r>
         <w:t>D2 – Discuss what insights have your group has gained from implementing a Semaphore.</w:t>
@@ -830,6 +324,119 @@
     </w:lvl>
   </w:abstractNum>
   <w:abstractNum w:abstractNumId="1" w15:restartNumberingAfterBreak="0">
+    <w:nsid w:val="07933B37"/>
+    <w:multiLevelType w:val="hybridMultilevel"/>
+    <w:tmpl w:val="F92A64FA"/>
+    <w:lvl w:ilvl="0" w:tplc="04090001">
+      <w:start w:val="1"/>
+      <w:numFmt w:val="bullet"/>
+      <w:lvlText w:val=""/>
+      <w:lvlJc w:val="left"/>
+      <w:pPr>
+        <w:ind w:left="1440" w:hanging="360"/>
+      </w:pPr>
+      <w:rPr>
+        <w:rFonts w:ascii="Symbol" w:hAnsi="Symbol" w:hint="default"/>
+      </w:rPr>
+    </w:lvl>
+    <w:lvl w:ilvl="1" w:tplc="04090003" w:tentative="1">
+      <w:start w:val="1"/>
+      <w:numFmt w:val="bullet"/>
+      <w:lvlText w:val="o"/>
+      <w:lvlJc w:val="left"/>
+      <w:pPr>
+        <w:ind w:left="2160" w:hanging="360"/>
+      </w:pPr>
+      <w:rPr>
+        <w:rFonts w:ascii="Courier New" w:hAnsi="Courier New" w:cs="Courier New" w:hint="default"/>
+      </w:rPr>
+    </w:lvl>
+    <w:lvl w:ilvl="2" w:tplc="04090005" w:tentative="1">
+      <w:start w:val="1"/>
+      <w:numFmt w:val="bullet"/>
+      <w:lvlText w:val=""/>
+      <w:lvlJc w:val="left"/>
+      <w:pPr>
+        <w:ind w:left="2880" w:hanging="360"/>
+      </w:pPr>
+      <w:rPr>
+        <w:rFonts w:ascii="Wingdings" w:hAnsi="Wingdings" w:hint="default"/>
+      </w:rPr>
+    </w:lvl>
+    <w:lvl w:ilvl="3" w:tplc="04090001" w:tentative="1">
+      <w:start w:val="1"/>
+      <w:numFmt w:val="bullet"/>
+      <w:lvlText w:val=""/>
+      <w:lvlJc w:val="left"/>
+      <w:pPr>
+        <w:ind w:left="3600" w:hanging="360"/>
+      </w:pPr>
+      <w:rPr>
+        <w:rFonts w:ascii="Symbol" w:hAnsi="Symbol" w:hint="default"/>
+      </w:rPr>
+    </w:lvl>
+    <w:lvl w:ilvl="4" w:tplc="04090003" w:tentative="1">
+      <w:start w:val="1"/>
+      <w:numFmt w:val="bullet"/>
+      <w:lvlText w:val="o"/>
+      <w:lvlJc w:val="left"/>
+      <w:pPr>
+        <w:ind w:left="4320" w:hanging="360"/>
+      </w:pPr>
+      <w:rPr>
+        <w:rFonts w:ascii="Courier New" w:hAnsi="Courier New" w:cs="Courier New" w:hint="default"/>
+      </w:rPr>
+    </w:lvl>
+    <w:lvl w:ilvl="5" w:tplc="04090005" w:tentative="1">
+      <w:start w:val="1"/>
+      <w:numFmt w:val="bullet"/>
+      <w:lvlText w:val=""/>
+      <w:lvlJc w:val="left"/>
+      <w:pPr>
+        <w:ind w:left="5040" w:hanging="360"/>
+      </w:pPr>
+      <w:rPr>
+        <w:rFonts w:ascii="Wingdings" w:hAnsi="Wingdings" w:hint="default"/>
+      </w:rPr>
+    </w:lvl>
+    <w:lvl w:ilvl="6" w:tplc="04090001" w:tentative="1">
+      <w:start w:val="1"/>
+      <w:numFmt w:val="bullet"/>
+      <w:lvlText w:val=""/>
+      <w:lvlJc w:val="left"/>
+      <w:pPr>
+        <w:ind w:left="5760" w:hanging="360"/>
+      </w:pPr>
+      <w:rPr>
+        <w:rFonts w:ascii="Symbol" w:hAnsi="Symbol" w:hint="default"/>
+      </w:rPr>
+    </w:lvl>
+    <w:lvl w:ilvl="7" w:tplc="04090003" w:tentative="1">
+      <w:start w:val="1"/>
+      <w:numFmt w:val="bullet"/>
+      <w:lvlText w:val="o"/>
+      <w:lvlJc w:val="left"/>
+      <w:pPr>
+        <w:ind w:left="6480" w:hanging="360"/>
+      </w:pPr>
+      <w:rPr>
+        <w:rFonts w:ascii="Courier New" w:hAnsi="Courier New" w:cs="Courier New" w:hint="default"/>
+      </w:rPr>
+    </w:lvl>
+    <w:lvl w:ilvl="8" w:tplc="04090005" w:tentative="1">
+      <w:start w:val="1"/>
+      <w:numFmt w:val="bullet"/>
+      <w:lvlText w:val=""/>
+      <w:lvlJc w:val="left"/>
+      <w:pPr>
+        <w:ind w:left="7200" w:hanging="360"/>
+      </w:pPr>
+      <w:rPr>
+        <w:rFonts w:ascii="Wingdings" w:hAnsi="Wingdings" w:hint="default"/>
+      </w:rPr>
+    </w:lvl>
+  </w:abstractNum>
+  <w:abstractNum w:abstractNumId="2" w15:restartNumberingAfterBreak="0">
     <w:nsid w:val="088E5560"/>
     <w:multiLevelType w:val="hybridMultilevel"/>
     <w:tmpl w:val="94B66E8E"/>
@@ -918,7 +525,7 @@
       </w:pPr>
     </w:lvl>
   </w:abstractNum>
-  <w:abstractNum w:abstractNumId="2" w15:restartNumberingAfterBreak="0">
+  <w:abstractNum w:abstractNumId="3" w15:restartNumberingAfterBreak="0">
     <w:nsid w:val="226E0212"/>
     <w:multiLevelType w:val="hybridMultilevel"/>
     <w:tmpl w:val="B3184706"/>
@@ -1007,7 +614,124 @@
       </w:pPr>
     </w:lvl>
   </w:abstractNum>
-  <w:abstractNum w:abstractNumId="3" w15:restartNumberingAfterBreak="0">
+  <w:abstractNum w:abstractNumId="4" w15:restartNumberingAfterBreak="0">
+    <w:nsid w:val="38CA6CD4"/>
+    <w:multiLevelType w:val="multilevel"/>
+    <w:tmpl w:val="84147FFE"/>
+    <w:lvl w:ilvl="0">
+      <w:start w:val="1"/>
+      <w:numFmt w:val="decimal"/>
+      <w:lvlText w:val="%1."/>
+      <w:lvlJc w:val="left"/>
+      <w:pPr>
+        <w:tabs>
+          <w:tab w:val="num" w:pos="720"/>
+        </w:tabs>
+        <w:ind w:left="720" w:hanging="360"/>
+      </w:pPr>
+    </w:lvl>
+    <w:lvl w:ilvl="1">
+      <w:start w:val="1"/>
+      <w:numFmt w:val="bullet"/>
+      <w:lvlText w:val="o"/>
+      <w:lvlJc w:val="left"/>
+      <w:pPr>
+        <w:tabs>
+          <w:tab w:val="num" w:pos="1440"/>
+        </w:tabs>
+        <w:ind w:left="1440" w:hanging="360"/>
+      </w:pPr>
+      <w:rPr>
+        <w:rFonts w:ascii="Courier New" w:hAnsi="Courier New" w:hint="default"/>
+        <w:sz w:val="20"/>
+      </w:rPr>
+    </w:lvl>
+    <w:lvl w:ilvl="2" w:tentative="1">
+      <w:start w:val="1"/>
+      <w:numFmt w:val="decimal"/>
+      <w:lvlText w:val="%3."/>
+      <w:lvlJc w:val="left"/>
+      <w:pPr>
+        <w:tabs>
+          <w:tab w:val="num" w:pos="2160"/>
+        </w:tabs>
+        <w:ind w:left="2160" w:hanging="360"/>
+      </w:pPr>
+    </w:lvl>
+    <w:lvl w:ilvl="3" w:tentative="1">
+      <w:start w:val="1"/>
+      <w:numFmt w:val="decimal"/>
+      <w:lvlText w:val="%4."/>
+      <w:lvlJc w:val="left"/>
+      <w:pPr>
+        <w:tabs>
+          <w:tab w:val="num" w:pos="2880"/>
+        </w:tabs>
+        <w:ind w:left="2880" w:hanging="360"/>
+      </w:pPr>
+    </w:lvl>
+    <w:lvl w:ilvl="4" w:tentative="1">
+      <w:start w:val="1"/>
+      <w:numFmt w:val="decimal"/>
+      <w:lvlText w:val="%5."/>
+      <w:lvlJc w:val="left"/>
+      <w:pPr>
+        <w:tabs>
+          <w:tab w:val="num" w:pos="3600"/>
+        </w:tabs>
+        <w:ind w:left="3600" w:hanging="360"/>
+      </w:pPr>
+    </w:lvl>
+    <w:lvl w:ilvl="5" w:tentative="1">
+      <w:start w:val="1"/>
+      <w:numFmt w:val="decimal"/>
+      <w:lvlText w:val="%6."/>
+      <w:lvlJc w:val="left"/>
+      <w:pPr>
+        <w:tabs>
+          <w:tab w:val="num" w:pos="4320"/>
+        </w:tabs>
+        <w:ind w:left="4320" w:hanging="360"/>
+      </w:pPr>
+    </w:lvl>
+    <w:lvl w:ilvl="6" w:tentative="1">
+      <w:start w:val="1"/>
+      <w:numFmt w:val="decimal"/>
+      <w:lvlText w:val="%7."/>
+      <w:lvlJc w:val="left"/>
+      <w:pPr>
+        <w:tabs>
+          <w:tab w:val="num" w:pos="5040"/>
+        </w:tabs>
+        <w:ind w:left="5040" w:hanging="360"/>
+      </w:pPr>
+    </w:lvl>
+    <w:lvl w:ilvl="7" w:tentative="1">
+      <w:start w:val="1"/>
+      <w:numFmt w:val="decimal"/>
+      <w:lvlText w:val="%8."/>
+      <w:lvlJc w:val="left"/>
+      <w:pPr>
+        <w:tabs>
+          <w:tab w:val="num" w:pos="5760"/>
+        </w:tabs>
+        <w:ind w:left="5760" w:hanging="360"/>
+      </w:pPr>
+    </w:lvl>
+    <w:lvl w:ilvl="8" w:tentative="1">
+      <w:start w:val="1"/>
+      <w:numFmt w:val="decimal"/>
+      <w:lvlText w:val="%9."/>
+      <w:lvlJc w:val="left"/>
+      <w:pPr>
+        <w:tabs>
+          <w:tab w:val="num" w:pos="6480"/>
+        </w:tabs>
+        <w:ind w:left="6480" w:hanging="360"/>
+      </w:pPr>
+    </w:lvl>
+  </w:abstractNum>
+  <w:abstractNum w:abstractNumId="5" w15:restartNumberingAfterBreak="0">
     <w:nsid w:val="4428627B"/>
     <w:multiLevelType w:val="hybridMultilevel"/>
     <w:tmpl w:val="AA609D76"/>
@@ -1023,7 +747,7 @@
         <w:rFonts w:hint="default"/>
       </w:rPr>
     </w:lvl>
-    <w:lvl w:ilvl="1" w:tplc="04090019" w:tentative="1">
+    <w:lvl w:ilvl="1" w:tplc="04090019">
       <w:start w:val="1"/>
       <w:numFmt w:val="lowerLetter"/>
       <w:lvlText w:val="%2."/>
@@ -1096,17 +820,327 @@
       </w:pPr>
     </w:lvl>
   </w:abstractNum>
+  <w:abstractNum w:abstractNumId="6" w15:restartNumberingAfterBreak="0">
+    <w:nsid w:val="50D71777"/>
+    <w:multiLevelType w:val="multilevel"/>
+    <w:tmpl w:val="D79E78F0"/>
+    <w:lvl w:ilvl="0">
+      <w:start w:val="1"/>
+      <w:numFmt w:val="bullet"/>
+      <w:lvlText w:val=""/>
+      <w:lvlJc w:val="left"/>
+      <w:pPr>
+        <w:tabs>
+          <w:tab w:val="num" w:pos="720"/>
+        </w:tabs>
+        <w:ind w:left="720" w:hanging="360"/>
+      </w:pPr>
+      <w:rPr>
+        <w:rFonts w:ascii="Symbol" w:hAnsi="Symbol" w:hint="default"/>
+        <w:sz w:val="20"/>
+      </w:rPr>
+    </w:lvl>
+    <w:lvl w:ilvl="1" w:tentative="1">
+      <w:start w:val="1"/>
+      <w:numFmt w:val="bullet"/>
+      <w:lvlText w:val="o"/>
+      <w:lvlJc w:val="left"/>
+      <w:pPr>
+        <w:tabs>
+          <w:tab w:val="num" w:pos="1440"/>
+        </w:tabs>
+        <w:ind w:left="1440" w:hanging="360"/>
+      </w:pPr>
+      <w:rPr>
+        <w:rFonts w:ascii="Courier New" w:hAnsi="Courier New" w:hint="default"/>
+        <w:sz w:val="20"/>
+      </w:rPr>
+    </w:lvl>
+    <w:lvl w:ilvl="2" w:tentative="1">
+      <w:start w:val="1"/>
+      <w:numFmt w:val="bullet"/>
+      <w:lvlText w:val=""/>
+      <w:lvlJc w:val="left"/>
+      <w:pPr>
+        <w:tabs>
+          <w:tab w:val="num" w:pos="2160"/>
+        </w:tabs>
+        <w:ind w:left="2160" w:hanging="360"/>
+      </w:pPr>
+      <w:rPr>
+        <w:rFonts w:ascii="Wingdings" w:hAnsi="Wingdings" w:hint="default"/>
+        <w:sz w:val="20"/>
+      </w:rPr>
+    </w:lvl>
+    <w:lvl w:ilvl="3" w:tentative="1">
+      <w:start w:val="1"/>
+      <w:numFmt w:val="bullet"/>
+      <w:lvlText w:val=""/>
+      <w:lvlJc w:val="left"/>
+      <w:pPr>
+        <w:tabs>
+          <w:tab w:val="num" w:pos="2880"/>
+        </w:tabs>
+        <w:ind w:left="2880" w:hanging="360"/>
+      </w:pPr>
+      <w:rPr>
+        <w:rFonts w:ascii="Wingdings" w:hAnsi="Wingdings" w:hint="default"/>
+        <w:sz w:val="20"/>
+      </w:rPr>
+    </w:lvl>
+    <w:lvl w:ilvl="4" w:tentative="1">
+      <w:start w:val="1"/>
+      <w:numFmt w:val="bullet"/>
+      <w:lvlText w:val=""/>
+      <w:lvlJc w:val="left"/>
+      <w:pPr>
+        <w:tabs>
+          <w:tab w:val="num" w:pos="3600"/>
+        </w:tabs>
+        <w:ind w:left="3600" w:hanging="360"/>
+      </w:pPr>
+      <w:rPr>
+        <w:rFonts w:ascii="Wingdings" w:hAnsi="Wingdings" w:hint="default"/>
+        <w:sz w:val="20"/>
+      </w:rPr>
+    </w:lvl>
+    <w:lvl w:ilvl="5" w:tentative="1">
+      <w:start w:val="1"/>
+      <w:numFmt w:val="bullet"/>
+      <w:lvlText w:val=""/>
+      <w:lvlJc w:val="left"/>
+      <w:pPr>
+        <w:tabs>
+          <w:tab w:val="num" w:pos="4320"/>
+        </w:tabs>
+        <w:ind w:left="4320" w:hanging="360"/>
+      </w:pPr>
+      <w:rPr>
+        <w:rFonts w:ascii="Wingdings" w:hAnsi="Wingdings" w:hint="default"/>
+        <w:sz w:val="20"/>
+      </w:rPr>
+    </w:lvl>
+    <w:lvl w:ilvl="6" w:tentative="1">
+      <w:start w:val="1"/>
+      <w:numFmt w:val="bullet"/>
+      <w:lvlText w:val=""/>
+      <w:lvlJc w:val="left"/>
+      <w:pPr>
+        <w:tabs>
+          <w:tab w:val="num" w:pos="5040"/>
+        </w:tabs>
+        <w:ind w:left="5040" w:hanging="360"/>
+      </w:pPr>
+      <w:rPr>
+        <w:rFonts w:ascii="Wingdings" w:hAnsi="Wingdings" w:hint="default"/>
+        <w:sz w:val="20"/>
+      </w:rPr>
+    </w:lvl>
+    <w:lvl w:ilvl="7" w:tentative="1">
+      <w:start w:val="1"/>
+      <w:numFmt w:val="bullet"/>
+      <w:lvlText w:val=""/>
+      <w:lvlJc w:val="left"/>
+      <w:pPr>
+        <w:tabs>
+          <w:tab w:val="num" w:pos="5760"/>
+        </w:tabs>
+        <w:ind w:left="5760" w:hanging="360"/>
+      </w:pPr>
+      <w:rPr>
+        <w:rFonts w:ascii="Wingdings" w:hAnsi="Wingdings" w:hint="default"/>
+        <w:sz w:val="20"/>
+      </w:rPr>
+    </w:lvl>
+    <w:lvl w:ilvl="8" w:tentative="1">
+      <w:start w:val="1"/>
+      <w:numFmt w:val="bullet"/>
+      <w:lvlText w:val=""/>
+      <w:lvlJc w:val="left"/>
+      <w:pPr>
+        <w:tabs>
+          <w:tab w:val="num" w:pos="6480"/>
+        </w:tabs>
+        <w:ind w:left="6480" w:hanging="360"/>
+      </w:pPr>
+      <w:rPr>
+        <w:rFonts w:ascii="Wingdings" w:hAnsi="Wingdings" w:hint="default"/>
+        <w:sz w:val="20"/>
+      </w:rPr>
+    </w:lvl>
+  </w:abstractNum>
+  <w:abstractNum w:abstractNumId="7" w15:restartNumberingAfterBreak="0">
+    <w:nsid w:val="6D18738E"/>
+    <w:multiLevelType w:val="multilevel"/>
+    <w:tmpl w:val="C15204DE"/>
+    <w:lvl w:ilvl="0">
+      <w:start w:val="1"/>
+      <w:numFmt w:val="bullet"/>
+      <w:lvlText w:val=""/>
+      <w:lvlJc w:val="left"/>
+      <w:pPr>
+        <w:tabs>
+          <w:tab w:val="num" w:pos="720"/>
+        </w:tabs>
+        <w:ind w:left="720" w:hanging="360"/>
+      </w:pPr>
+      <w:rPr>
+        <w:rFonts w:ascii="Symbol" w:hAnsi="Symbol" w:hint="default"/>
+        <w:sz w:val="20"/>
+      </w:rPr>
+    </w:lvl>
+    <w:lvl w:ilvl="1" w:tentative="1">
+      <w:start w:val="1"/>
+      <w:numFmt w:val="bullet"/>
+      <w:lvlText w:val="o"/>
+      <w:lvlJc w:val="left"/>
+      <w:pPr>
+        <w:tabs>
+          <w:tab w:val="num" w:pos="1440"/>
+        </w:tabs>
+        <w:ind w:left="1440" w:hanging="360"/>
+      </w:pPr>
+      <w:rPr>
+        <w:rFonts w:ascii="Courier New" w:hAnsi="Courier New" w:hint="default"/>
+        <w:sz w:val="20"/>
+      </w:rPr>
+    </w:lvl>
+    <w:lvl w:ilvl="2" w:tentative="1">
+      <w:start w:val="1"/>
+      <w:numFmt w:val="bullet"/>
+      <w:lvlText w:val=""/>
+      <w:lvlJc w:val="left"/>
+      <w:pPr>
+        <w:tabs>
+          <w:tab w:val="num" w:pos="2160"/>
+        </w:tabs>
+        <w:ind w:left="2160" w:hanging="360"/>
+      </w:pPr>
+      <w:rPr>
+        <w:rFonts w:ascii="Wingdings" w:hAnsi="Wingdings" w:hint="default"/>
+        <w:sz w:val="20"/>
+      </w:rPr>
+    </w:lvl>
+    <w:lvl w:ilvl="3" w:tentative="1">
+      <w:start w:val="1"/>
+      <w:numFmt w:val="bullet"/>
+      <w:lvlText w:val=""/>
+      <w:lvlJc w:val="left"/>
+      <w:pPr>
+        <w:tabs>
+          <w:tab w:val="num" w:pos="2880"/>
+        </w:tabs>
+        <w:ind w:left="2880" w:hanging="360"/>
+      </w:pPr>
+      <w:rPr>
+        <w:rFonts w:ascii="Wingdings" w:hAnsi="Wingdings" w:hint="default"/>
+        <w:sz w:val="20"/>
+      </w:rPr>
+    </w:lvl>
+    <w:lvl w:ilvl="4" w:tentative="1">
+      <w:start w:val="1"/>
+      <w:numFmt w:val="bullet"/>
+      <w:lvlText w:val=""/>
+      <w:lvlJc w:val="left"/>
+      <w:pPr>
+        <w:tabs>
+          <w:tab w:val="num" w:pos="3600"/>
+        </w:tabs>
+        <w:ind w:left="3600" w:hanging="360"/>
+      </w:pPr>
+      <w:rPr>
+        <w:rFonts w:ascii="Wingdings" w:hAnsi="Wingdings" w:hint="default"/>
+        <w:sz w:val="20"/>
+      </w:rPr>
+    </w:lvl>
+    <w:lvl w:ilvl="5" w:tentative="1">
+      <w:start w:val="1"/>
+      <w:numFmt w:val="bullet"/>
+      <w:lvlText w:val=""/>
+      <w:lvlJc w:val="left"/>
+      <w:pPr>
+        <w:tabs>
+          <w:tab w:val="num" w:pos="4320"/>
+        </w:tabs>
+        <w:ind w:left="4320" w:hanging="360"/>
+      </w:pPr>
+      <w:rPr>
+        <w:rFonts w:ascii="Wingdings" w:hAnsi="Wingdings" w:hint="default"/>
+        <w:sz w:val="20"/>
+      </w:rPr>
+    </w:lvl>
+    <w:lvl w:ilvl="6" w:tentative="1">
+      <w:start w:val="1"/>
+      <w:numFmt w:val="bullet"/>
+      <w:lvlText w:val=""/>
+      <w:lvlJc w:val="left"/>
+      <w:pPr>
+        <w:tabs>
+          <w:tab w:val="num" w:pos="5040"/>
+        </w:tabs>
+        <w:ind w:left="5040" w:hanging="360"/>
+      </w:pPr>
+      <w:rPr>
+        <w:rFonts w:ascii="Wingdings" w:hAnsi="Wingdings" w:hint="default"/>
+        <w:sz w:val="20"/>
+      </w:rPr>
+    </w:lvl>
+    <w:lvl w:ilvl="7" w:tentative="1">
+      <w:start w:val="1"/>
+      <w:numFmt w:val="bullet"/>
+      <w:lvlText w:val=""/>
+      <w:lvlJc w:val="left"/>
+      <w:pPr>
+        <w:tabs>
+          <w:tab w:val="num" w:pos="5760"/>
+        </w:tabs>
+        <w:ind w:left="5760" w:hanging="360"/>
+      </w:pPr>
+      <w:rPr>
+        <w:rFonts w:ascii="Wingdings" w:hAnsi="Wingdings" w:hint="default"/>
+        <w:sz w:val="20"/>
+      </w:rPr>
+    </w:lvl>
+    <w:lvl w:ilvl="8" w:tentative="1">
+      <w:start w:val="1"/>
+      <w:numFmt w:val="bullet"/>
+      <w:lvlText w:val=""/>
+      <w:lvlJc w:val="left"/>
+      <w:pPr>
+        <w:tabs>
+          <w:tab w:val="num" w:pos="6480"/>
+        </w:tabs>
+        <w:ind w:left="6480" w:hanging="360"/>
+      </w:pPr>
+      <w:rPr>
+        <w:rFonts w:ascii="Wingdings" w:hAnsi="Wingdings" w:hint="default"/>
+        <w:sz w:val="20"/>
+      </w:rPr>
+    </w:lvl>
+  </w:abstractNum>
   <w:num w:numId="1" w16cid:durableId="1098791561">
-    <w:abstractNumId w:val="2"/>
+    <w:abstractNumId w:val="3"/>
   </w:num>
   <w:num w:numId="2" w16cid:durableId="762730045">
     <w:abstractNumId w:val="0"/>
   </w:num>
   <w:num w:numId="3" w16cid:durableId="1024553259">
+    <w:abstractNumId w:val="2"/>
+  </w:num>
+  <w:num w:numId="4" w16cid:durableId="1725062886">
+    <w:abstractNumId w:val="5"/>
+  </w:num>
+  <w:num w:numId="5" w16cid:durableId="1456211873">
+    <w:abstractNumId w:val="4"/>
+  </w:num>
+  <w:num w:numId="6" w16cid:durableId="1032994719">
     <w:abstractNumId w:val="1"/>
   </w:num>
-  <w:num w:numId="4" w16cid:durableId="1725062886">
-    <w:abstractNumId w:val="3"/>
+  <w:num w:numId="7" w16cid:durableId="389498180">
+    <w:abstractNumId w:val="6"/>
+  </w:num>
+  <w:num w:numId="8" w16cid:durableId="115372830">
+    <w:abstractNumId w:val="7"/>
   </w:num>
 </w:numbering>
 </file>
@@ -2027,6 +2061,29 @@
       <w:spacing w:val="5"/>
     </w:rPr>
   </w:style>
+  <w:style w:type="character" w:styleId="Hyperlink">
+    <w:name w:val="Hyperlink"/>
+    <w:basedOn w:val="DefaultParagraphFont"/>
+    <w:uiPriority w:val="99"/>
+    <w:unhideWhenUsed/>
+    <w:rsid w:val="005170A1"/>
+    <w:rPr>
+      <w:color w:val="467886" w:themeColor="hyperlink"/>
+      <w:u w:val="single"/>
+    </w:rPr>
+  </w:style>
+  <w:style w:type="character" w:styleId="UnresolvedMention">
+    <w:name w:val="Unresolved Mention"/>
+    <w:basedOn w:val="DefaultParagraphFont"/>
+    <w:uiPriority w:val="99"/>
+    <w:semiHidden/>
+    <w:unhideWhenUsed/>
+    <w:rsid w:val="005170A1"/>
+    <w:rPr>
+      <w:color w:val="605E5C"/>
+      <w:shd w:val="clear" w:color="auto" w:fill="E1DFDD"/>
+    </w:rPr>
+  </w:style>
 </w:styles>
 </file>
 

</xml_diff>